<commit_message>
Word: compactar la guía de Puertos a 17 páginas (rango 14-18)
- Se fusionan Thunderbolt+FireWire con PS/2+DIN-5 y chuleta de colores con glosario
  (glosario a 2 columnas); «datos que faltan» se integra en la página de audio y
  «no confundir» en la tabla maestra.
- 25 imágenes y 19 tablas conservadas; verificación de paginación sin desbordes.

Co-authored-by: arena-agent <297053741+arena-agent@users.noreply.github.com>
</commit_message>
<xml_diff>
--- a/Puertos de Comunicación de PC - Guía Completa (Word).docx
+++ b/Puertos de Comunicación de PC - Guía Completa (Word).docx
@@ -2510,28 +2510,28 @@
       <w:r>
         <w:rPr>
           <w:b/>
-          <w:sz w:val="21"/>
+          <w:sz w:val="20"/>
         </w:rPr>
         <w:t>Descripción general:</w:t>
       </w:r>
       <w:r>
         <w:rPr>
           <w:b w:val="0"/>
-          <w:sz w:val="21"/>
+          <w:sz w:val="20"/>
         </w:rPr>
         <w:t xml:space="preserve"> interfaz de ultra alta velocidad que combina </w:t>
       </w:r>
       <w:r>
         <w:rPr>
           <w:b/>
-          <w:sz w:val="21"/>
+          <w:sz w:val="20"/>
         </w:rPr>
         <w:t>PCI Express y DisplayPort</w:t>
       </w:r>
       <w:r>
         <w:rPr>
           <w:b w:val="0"/>
-          <w:sz w:val="21"/>
+          <w:sz w:val="20"/>
         </w:rPr>
         <w:t xml:space="preserve"> (más alimentación) en un solo cable.</w:t>
       </w:r>
@@ -2558,7 +2558,7 @@
             <w:r>
               <w:drawing>
                 <wp:inline xmlns:a="http://schemas.openxmlformats.org/drawingml/2006/main" xmlns:pic="http://schemas.openxmlformats.org/drawingml/2006/picture">
-                  <wp:extent cx="2880360" cy="1550815"/>
+                  <wp:extent cx="2606040" cy="1403118"/>
                   <wp:docPr id="5" name="Picture 5"/>
                   <wp:cNvGraphicFramePr>
                     <a:graphicFrameLocks noChangeAspect="1"/>
@@ -2579,7 +2579,7 @@
                         <pic:spPr>
                           <a:xfrm>
                             <a:off x="0" y="0"/>
-                            <a:ext cx="2880360" cy="1550815"/>
+                            <a:ext cx="2606040" cy="1403118"/>
                           </a:xfrm>
                           <a:prstGeom prst="rect"/>
                         </pic:spPr>
@@ -2602,7 +2602,7 @@
             <w:r>
               <w:drawing>
                 <wp:inline xmlns:a="http://schemas.openxmlformats.org/drawingml/2006/main" xmlns:pic="http://schemas.openxmlformats.org/drawingml/2006/picture">
-                  <wp:extent cx="2880360" cy="1612202"/>
+                  <wp:extent cx="2606040" cy="1458658"/>
                   <wp:docPr id="6" name="Picture 6"/>
                   <wp:cNvGraphicFramePr>
                     <a:graphicFrameLocks noChangeAspect="1"/>
@@ -2623,7 +2623,7 @@
                         <pic:spPr>
                           <a:xfrm>
                             <a:off x="0" y="0"/>
-                            <a:ext cx="2880360" cy="1612202"/>
+                            <a:ext cx="2606040" cy="1458658"/>
                           </a:xfrm>
                           <a:prstGeom prst="rect"/>
                         </pic:spPr>
@@ -2908,12 +2908,7 @@
           <w:b w:val="0"/>
           <w:sz w:val="20"/>
         </w:rPr>
-        <w:t xml:space="preserve"> videocámaras DV, discos duros externos de audio/vídeo e interfaces de audio profesional. Retirado por Apple en 2011; su relevo lo tomaron USB 2.0/3.0, eSATA y Thunderbolt.</w:t>
-      </w:r>
-    </w:p>
-    <w:p>
-      <w:r>
-        <w:br w:type="page"/>
+        <w:t xml:space="preserve"> videocámaras DV, discos duros externos de audio/vídeo y audio profesional. Retirado por Apple en 2011 (le sustituyeron USB, eSATA y Thunderbolt).</w:t>
       </w:r>
     </w:p>
     <w:p>
@@ -2939,30 +2934,30 @@
       <w:r>
         <w:rPr>
           <w:b/>
-          <w:sz w:val="21"/>
+          <w:sz w:val="20"/>
         </w:rPr>
         <w:t>Descripción general:</w:t>
       </w:r>
       <w:r>
         <w:rPr>
           <w:b w:val="0"/>
-          <w:sz w:val="21"/>
+          <w:sz w:val="20"/>
         </w:rPr>
         <w:t xml:space="preserve"> conector circular </w:t>
       </w:r>
       <w:r>
         <w:rPr>
           <w:b/>
-          <w:sz w:val="21"/>
+          <w:sz w:val="20"/>
         </w:rPr>
         <w:t>mini-DIN de 6 pines</w:t>
       </w:r>
       <w:r>
         <w:rPr>
           <w:b w:val="0"/>
-          <w:sz w:val="21"/>
-        </w:rPr>
-        <w:t xml:space="preserve"> para periféricos de control (IBM PS/2, 1987), con identificación por código de colores universal estricto.</w:t>
+          <w:sz w:val="20"/>
+        </w:rPr>
+        <w:t xml:space="preserve"> para periféricos de control (IBM PS/2, 1987), con código de colores universal estricto.</w:t>
       </w:r>
     </w:p>
     <w:tbl>
@@ -2987,7 +2982,7 @@
             <w:r>
               <w:drawing>
                 <wp:inline xmlns:a="http://schemas.openxmlformats.org/drawingml/2006/main" xmlns:pic="http://schemas.openxmlformats.org/drawingml/2006/picture">
-                  <wp:extent cx="3017520" cy="1683119"/>
+                  <wp:extent cx="2743200" cy="1530108"/>
                   <wp:docPr id="7" name="Picture 7"/>
                   <wp:cNvGraphicFramePr>
                     <a:graphicFrameLocks noChangeAspect="1"/>
@@ -3008,7 +3003,7 @@
                         <pic:spPr>
                           <a:xfrm>
                             <a:off x="0" y="0"/>
-                            <a:ext cx="3017520" cy="1683119"/>
+                            <a:ext cx="2743200" cy="1530108"/>
                           </a:xfrm>
                           <a:prstGeom prst="rect"/>
                         </pic:spPr>
@@ -3031,7 +3026,7 @@
             <w:r>
               <w:drawing>
                 <wp:inline xmlns:a="http://schemas.openxmlformats.org/drawingml/2006/main" xmlns:pic="http://schemas.openxmlformats.org/drawingml/2006/picture">
-                  <wp:extent cx="2148840" cy="1888717"/>
+                  <wp:extent cx="2011680" cy="1768161"/>
                   <wp:docPr id="8" name="Picture 8"/>
                   <wp:cNvGraphicFramePr>
                     <a:graphicFrameLocks noChangeAspect="1"/>
@@ -3052,7 +3047,7 @@
                         <pic:spPr>
                           <a:xfrm>
                             <a:off x="0" y="0"/>
-                            <a:ext cx="2148840" cy="1888717"/>
+                            <a:ext cx="2011680" cy="1768161"/>
                           </a:xfrm>
                           <a:prstGeom prst="rect"/>
                         </pic:spPr>
@@ -3187,7 +3182,7 @@
           <w:b w:val="0"/>
           <w:sz w:val="20"/>
         </w:rPr>
-        <w:t xml:space="preserve"> teclados y ratones de conexión directa. Muy apreciado en teclados mecánicos por su NKRO nativo. De los 6 pines solo 4 son activos (DATA, CLK, +5 V, GND); no es hot-plug en BIOS antiguos.</w:t>
+        <w:t xml:space="preserve"> teclados y ratones de conexión directa; muy apreciado en teclados mecánicos por su NKRO nativo. De los 6 pines solo 4 son activos (DATA, CLK, +5 V, GND); no es hot-plug en BIOS antiguos.</w:t>
       </w:r>
     </w:p>
     <w:p>
@@ -3905,7 +3900,7 @@
       <w:r>
         <w:drawing>
           <wp:inline xmlns:a="http://schemas.openxmlformats.org/drawingml/2006/main" xmlns:pic="http://schemas.openxmlformats.org/drawingml/2006/picture">
-            <wp:extent cx="3931920" cy="1965960"/>
+            <wp:extent cx="3703320" cy="1851660"/>
             <wp:docPr id="12" name="Picture 12"/>
             <wp:cNvGraphicFramePr>
               <a:graphicFrameLocks noChangeAspect="1"/>
@@ -3926,7 +3921,7 @@
                   <pic:spPr>
                     <a:xfrm>
                       <a:off x="0" y="0"/>
-                      <a:ext cx="3931920" cy="1965960"/>
+                      <a:ext cx="3703320" cy="1851660"/>
                     </a:xfrm>
                     <a:prstGeom prst="rect"/>
                   </pic:spPr>
@@ -7471,6 +7466,256 @@
       </w:pPr>
     </w:p>
     <w:p>
+      <w:pPr>
+        <w:pStyle w:val="Heading2"/>
+      </w:pPr>
+      <w:r>
+        <w:t>Datos que suelen faltar · Resumen</w:t>
+      </w:r>
+    </w:p>
+    <w:tbl>
+      <w:tblPr>
+        <w:tblStyle w:val="TableGrid"/>
+        <w:tblW w:type="auto" w:w="0"/>
+        <w:jc w:val="center"/>
+        <w:tblLook w:firstColumn="1" w:firstRow="1" w:lastColumn="0" w:lastRow="0" w:noHBand="0" w:noVBand="1" w:val="04A0"/>
+      </w:tblPr>
+      <w:tblGrid>
+        <w:gridCol w:w="4896"/>
+        <w:gridCol w:w="4896"/>
+      </w:tblGrid>
+      <w:tr>
+        <w:tc>
+          <w:tcPr>
+            <w:tcW w:type="dxa" w:w="2520"/>
+            <w:shd w:val="clear" w:color="auto" w:fill="0E7C94"/>
+          </w:tcPr>
+          <w:p>
+            <w:pPr>
+              <w:spacing w:after="20" w:before="20"/>
+            </w:pPr>
+            <w:r>
+              <w:rPr>
+                <w:b/>
+                <w:color w:val="FFFFFF"/>
+                <w:sz w:val="18"/>
+              </w:rPr>
+              <w:t>Parámetro</w:t>
+            </w:r>
+          </w:p>
+        </w:tc>
+        <w:tc>
+          <w:tcPr>
+            <w:tcW w:type="dxa" w:w="7272"/>
+            <w:shd w:val="clear" w:color="auto" w:fill="0E7C94"/>
+          </w:tcPr>
+          <w:p>
+            <w:pPr>
+              <w:spacing w:after="20" w:before="20"/>
+            </w:pPr>
+            <w:r>
+              <w:rPr>
+                <w:b/>
+                <w:color w:val="FFFFFF"/>
+                <w:sz w:val="18"/>
+              </w:rPr>
+              <w:t>Valores prácticos</w:t>
+            </w:r>
+          </w:p>
+        </w:tc>
+      </w:tr>
+      <w:tr>
+        <w:tc>
+          <w:tcPr>
+            <w:tcW w:type="dxa" w:w="4896"/>
+          </w:tcPr>
+          <w:p>
+            <w:pPr>
+              <w:spacing w:after="20" w:before="20"/>
+            </w:pPr>
+            <w:r>
+              <w:rPr>
+                <w:b/>
+                <w:color w:val="0D2B45"/>
+                <w:sz w:val="18"/>
+              </w:rPr>
+              <w:t>Alimentación USB</w:t>
+            </w:r>
+          </w:p>
+        </w:tc>
+        <w:tc>
+          <w:tcPr>
+            <w:tcW w:type="dxa" w:w="4896"/>
+          </w:tcPr>
+          <w:p>
+            <w:pPr>
+              <w:spacing w:after="20" w:before="20"/>
+            </w:pPr>
+            <w:r>
+              <w:rPr>
+                <w:b w:val="0"/>
+                <w:sz w:val="18"/>
+              </w:rPr>
+              <w:t>2.5 W (2.0) → 4.5 W (3.x) → 7.5 W (BC 1.2) → 240 W (USB-C PD 3.1)</w:t>
+            </w:r>
+          </w:p>
+        </w:tc>
+      </w:tr>
+      <w:tr>
+        <w:tc>
+          <w:tcPr>
+            <w:tcW w:type="dxa" w:w="4896"/>
+          </w:tcPr>
+          <w:p>
+            <w:pPr>
+              <w:spacing w:after="20" w:before="20"/>
+            </w:pPr>
+            <w:r>
+              <w:rPr>
+                <w:b/>
+                <w:color w:val="0D2B45"/>
+                <w:sz w:val="18"/>
+              </w:rPr>
+              <w:t>Longitudes de cable</w:t>
+            </w:r>
+          </w:p>
+        </w:tc>
+        <w:tc>
+          <w:tcPr>
+            <w:tcW w:type="dxa" w:w="4896"/>
+          </w:tcPr>
+          <w:p>
+            <w:pPr>
+              <w:spacing w:after="20" w:before="20"/>
+            </w:pPr>
+            <w:r>
+              <w:rPr>
+                <w:b w:val="0"/>
+                <w:sz w:val="18"/>
+              </w:rPr>
+              <w:t>USB 2.0: 5 m · USB 3.x: 2-3 m · USB4/TB: 0.8-2 m · red: 100 m · RS-232: 15 m · S/PDIF: 10 m · eSATA: 2 m</w:t>
+            </w:r>
+          </w:p>
+        </w:tc>
+      </w:tr>
+      <w:tr>
+        <w:tc>
+          <w:tcPr>
+            <w:tcW w:type="dxa" w:w="4896"/>
+          </w:tcPr>
+          <w:p>
+            <w:pPr>
+              <w:spacing w:after="20" w:before="20"/>
+            </w:pPr>
+            <w:r>
+              <w:rPr>
+                <w:b/>
+                <w:color w:val="0D2B45"/>
+                <w:sz w:val="18"/>
+              </w:rPr>
+              <w:t>PoE (Ethernet)</w:t>
+            </w:r>
+          </w:p>
+        </w:tc>
+        <w:tc>
+          <w:tcPr>
+            <w:tcW w:type="dxa" w:w="4896"/>
+          </w:tcPr>
+          <w:p>
+            <w:pPr>
+              <w:spacing w:after="20" w:before="20"/>
+            </w:pPr>
+            <w:r>
+              <w:rPr>
+                <w:b w:val="0"/>
+                <w:sz w:val="18"/>
+              </w:rPr>
+              <w:t>802.3af 15.4 W · 802.3at 30 W · 802.3bt 60-100 W</w:t>
+            </w:r>
+          </w:p>
+        </w:tc>
+      </w:tr>
+      <w:tr>
+        <w:tc>
+          <w:tcPr>
+            <w:tcW w:type="dxa" w:w="4896"/>
+          </w:tcPr>
+          <w:p>
+            <w:pPr>
+              <w:spacing w:after="20" w:before="20"/>
+            </w:pPr>
+            <w:r>
+              <w:rPr>
+                <w:b/>
+                <w:color w:val="0D2B45"/>
+                <w:sz w:val="18"/>
+              </w:rPr>
+              <w:t>Audio TRRS</w:t>
+            </w:r>
+          </w:p>
+        </w:tc>
+        <w:tc>
+          <w:tcPr>
+            <w:tcW w:type="dxa" w:w="4896"/>
+          </w:tcPr>
+          <w:p>
+            <w:pPr>
+              <w:spacing w:after="20" w:before="20"/>
+            </w:pPr>
+            <w:r>
+              <w:rPr>
+                <w:b w:val="0"/>
+                <w:sz w:val="18"/>
+              </w:rPr>
+              <w:t>CTIA (estándar de smartphones) y OMTP (antiguo): incompatibles entre sí</w:t>
+            </w:r>
+          </w:p>
+        </w:tc>
+      </w:tr>
+      <w:tr>
+        <w:tc>
+          <w:tcPr>
+            <w:tcW w:type="dxa" w:w="4896"/>
+          </w:tcPr>
+          <w:p>
+            <w:pPr>
+              <w:spacing w:after="20" w:before="20"/>
+            </w:pPr>
+            <w:r>
+              <w:rPr>
+                <w:b/>
+                <w:color w:val="0D2B45"/>
+                <w:sz w:val="18"/>
+              </w:rPr>
+              <w:t>Video SD</w:t>
+            </w:r>
+          </w:p>
+        </w:tc>
+        <w:tc>
+          <w:tcPr>
+            <w:tcW w:type="dxa" w:w="4896"/>
+          </w:tcPr>
+          <w:p>
+            <w:pPr>
+              <w:spacing w:after="20" w:before="20"/>
+            </w:pPr>
+            <w:r>
+              <w:rPr>
+                <w:b w:val="0"/>
+                <w:sz w:val="18"/>
+              </w:rPr>
+              <w:t>Compuesto: 480i/576i multiplexado · S-Video: 480i/576i con Y/C separados</w:t>
+            </w:r>
+          </w:p>
+        </w:tc>
+      </w:tr>
+    </w:tbl>
+    <w:p>
+      <w:pPr>
+        <w:spacing w:after="40"/>
+      </w:pPr>
+    </w:p>
+    <w:p>
       <w:r>
         <w:br w:type="page"/>
       </w:r>
@@ -7710,7 +7955,7 @@
       <w:r>
         <w:drawing>
           <wp:inline xmlns:a="http://schemas.openxmlformats.org/drawingml/2006/main" xmlns:pic="http://schemas.openxmlformats.org/drawingml/2006/picture">
-            <wp:extent cx="3520440" cy="2127039"/>
+            <wp:extent cx="3200400" cy="1933671"/>
             <wp:docPr id="24" name="Picture 24"/>
             <wp:cNvGraphicFramePr>
               <a:graphicFrameLocks noChangeAspect="1"/>
@@ -7731,7 +7976,7 @@
                   <pic:spPr>
                     <a:xfrm>
                       <a:off x="0" y="0"/>
-                      <a:ext cx="3520440" cy="2127039"/>
+                      <a:ext cx="3200400" cy="1933671"/>
                     </a:xfrm>
                     <a:prstGeom prst="rect"/>
                   </pic:spPr>
@@ -9960,6 +10205,162 @@
       </w:pPr>
     </w:p>
     <w:p>
+      <w:pPr>
+        <w:pStyle w:val="Heading2"/>
+      </w:pPr>
+      <w:r>
+        <w:t>No confundir · Pares que se parecen</w:t>
+      </w:r>
+    </w:p>
+    <w:p>
+      <w:pPr>
+        <w:pStyle w:val="ListBullet"/>
+        <w:spacing w:after="40" w:before="0"/>
+      </w:pPr>
+      <w:r>
+        <w:rPr>
+          <w:b/>
+          <w:sz w:val="20"/>
+        </w:rPr>
+        <w:t>RJ-45 vs RJ-11:</w:t>
+      </w:r>
+      <w:r>
+        <w:rPr>
+          <w:b w:val="0"/>
+          <w:sz w:val="20"/>
+        </w:rPr>
+        <w:t xml:space="preserve"> 8 contactos (red) frente a 2-4 (teléfono); nunca forzar uno en el otro.</w:t>
+      </w:r>
+    </w:p>
+    <w:p>
+      <w:pPr>
+        <w:pStyle w:val="ListBullet"/>
+        <w:spacing w:after="40" w:before="0"/>
+      </w:pPr>
+      <w:r>
+        <w:rPr>
+          <w:b/>
+          <w:sz w:val="20"/>
+        </w:rPr>
+        <w:t>USB-C vs Thunderbolt:</w:t>
+      </w:r>
+      <w:r>
+        <w:rPr>
+          <w:b w:val="0"/>
+          <w:sz w:val="20"/>
+        </w:rPr>
+        <w:t xml:space="preserve"> conector idéntico; solo el </w:t>
+      </w:r>
+      <w:r>
+        <w:rPr>
+          <w:b/>
+          <w:sz w:val="20"/>
+        </w:rPr>
+        <w:t>icono del rayo ⚡</w:t>
+      </w:r>
+      <w:r>
+        <w:rPr>
+          <w:b w:val="0"/>
+          <w:sz w:val="20"/>
+        </w:rPr>
+        <w:t xml:space="preserve"> confirma Thunderbolt (eGPU, dos pantallas).</w:t>
+      </w:r>
+    </w:p>
+    <w:p>
+      <w:pPr>
+        <w:pStyle w:val="ListBullet"/>
+        <w:spacing w:after="40" w:before="0"/>
+      </w:pPr>
+      <w:r>
+        <w:rPr>
+          <w:b/>
+          <w:sz w:val="20"/>
+        </w:rPr>
+        <w:t>HDMI vs DisplayPort:</w:t>
+      </w:r>
+      <w:r>
+        <w:rPr>
+          <w:b w:val="0"/>
+          <w:sz w:val="20"/>
+        </w:rPr>
+        <w:t xml:space="preserve"> HDMI con dos esquinas biseladas y sin pestillo; DP con una esquina y </w:t>
+      </w:r>
+      <w:r>
+        <w:rPr>
+          <w:b/>
+          <w:sz w:val="20"/>
+        </w:rPr>
+        <w:t>pestillo de seguridad</w:t>
+      </w:r>
+      <w:r>
+        <w:rPr>
+          <w:b w:val="0"/>
+          <w:sz w:val="20"/>
+        </w:rPr>
+        <w:t>.</w:t>
+      </w:r>
+    </w:p>
+    <w:p>
+      <w:pPr>
+        <w:pStyle w:val="ListBullet"/>
+        <w:spacing w:after="40" w:before="0"/>
+      </w:pPr>
+      <w:r>
+        <w:rPr>
+          <w:b/>
+          <w:sz w:val="20"/>
+        </w:rPr>
+        <w:t>USB-A 2.0 vs 3.0:</w:t>
+      </w:r>
+      <w:r>
+        <w:rPr>
+          <w:b w:val="0"/>
+          <w:sz w:val="20"/>
+        </w:rPr>
+        <w:t xml:space="preserve"> misma forma; el color interior (negro vs azul) los delata.</w:t>
+      </w:r>
+    </w:p>
+    <w:p>
+      <w:pPr>
+        <w:pStyle w:val="ListBullet"/>
+        <w:spacing w:after="40" w:before="0"/>
+      </w:pPr>
+      <w:r>
+        <w:rPr>
+          <w:b/>
+          <w:sz w:val="20"/>
+        </w:rPr>
+        <w:t>DVI-I vs DVI-D:</w:t>
+      </w:r>
+      <w:r>
+        <w:rPr>
+          <w:b w:val="0"/>
+          <w:sz w:val="20"/>
+        </w:rPr>
+        <w:t xml:space="preserve"> el DVI-I tiene 4 pines analógicos y adapta a VGA pasivamente.</w:t>
+      </w:r>
+    </w:p>
+    <w:p>
+      <w:pPr>
+        <w:pStyle w:val="ListBullet"/>
+        <w:spacing w:after="40" w:before="0"/>
+      </w:pPr>
+      <w:r>
+        <w:rPr>
+          <w:b/>
+          <w:sz w:val="20"/>
+        </w:rPr>
+        <w:t>Mini-B vs Micro-B:</w:t>
+      </w:r>
+      <w:r>
+        <w:rPr>
+          <w:b w:val="0"/>
+          <w:sz w:val="20"/>
+        </w:rPr>
+        <w:t xml:space="preserve"> Mini-B es más grueso y trapezoidal; Micro-B, fino con rebeles.</w:t>
+      </w:r>
+    </w:p>
+    <w:p>
       <w:r>
         <w:br w:type="page"/>
       </w:r>
@@ -10012,7 +10413,7 @@
               <w:rPr>
                 <w:b/>
                 <w:color w:val="FFFFFF"/>
-                <w:sz w:val="18"/>
+                <w:sz w:val="16"/>
               </w:rPr>
               <w:t>Color / elemento</w:t>
             </w:r>
@@ -10031,7 +10432,7 @@
               <w:rPr>
                 <w:b/>
                 <w:color w:val="FFFFFF"/>
-                <w:sz w:val="18"/>
+                <w:sz w:val="16"/>
               </w:rPr>
               <w:t>Qué indica</w:t>
             </w:r>
@@ -10050,7 +10451,7 @@
               <w:rPr>
                 <w:b/>
                 <w:color w:val="FFFFFF"/>
-                <w:sz w:val="18"/>
+                <w:sz w:val="16"/>
               </w:rPr>
               <w:t>Dónde se ve</w:t>
             </w:r>
@@ -10070,7 +10471,7 @@
               <w:rPr>
                 <w:b/>
                 <w:color w:val="0D2B45"/>
-                <w:sz w:val="18"/>
+                <w:sz w:val="16"/>
               </w:rPr>
               <w:t>USB blanco / gris</w:t>
             </w:r>
@@ -10087,7 +10488,7 @@
             <w:r>
               <w:rPr>
                 <w:b w:val="0"/>
-                <w:sz w:val="18"/>
+                <w:sz w:val="16"/>
               </w:rPr>
               <w:t>USB 1.0-1.1 · 12 Mbps</w:t>
             </w:r>
@@ -10104,7 +10505,7 @@
             <w:r>
               <w:rPr>
                 <w:b w:val="0"/>
-                <w:sz w:val="18"/>
+                <w:sz w:val="16"/>
               </w:rPr>
               <w:t>lengüeta interior del conector</w:t>
             </w:r>
@@ -10124,7 +10525,7 @@
               <w:rPr>
                 <w:b/>
                 <w:color w:val="0D2B45"/>
-                <w:sz w:val="18"/>
+                <w:sz w:val="16"/>
               </w:rPr>
               <w:t>USB negro</w:t>
             </w:r>
@@ -10141,7 +10542,7 @@
             <w:r>
               <w:rPr>
                 <w:b w:val="0"/>
-                <w:sz w:val="18"/>
+                <w:sz w:val="16"/>
               </w:rPr>
               <w:t>USB 2.0 · 480 Mbps</w:t>
             </w:r>
@@ -10158,7 +10559,7 @@
             <w:r>
               <w:rPr>
                 <w:b w:val="0"/>
-                <w:sz w:val="18"/>
+                <w:sz w:val="16"/>
               </w:rPr>
               <w:t>lengüeta interior del conector</w:t>
             </w:r>
@@ -10178,7 +10579,7 @@
               <w:rPr>
                 <w:b/>
                 <w:color w:val="0D2B45"/>
-                <w:sz w:val="18"/>
+                <w:sz w:val="16"/>
               </w:rPr>
               <w:t>USB azul (+ SS)</w:t>
             </w:r>
@@ -10195,7 +10596,7 @@
             <w:r>
               <w:rPr>
                 <w:b w:val="0"/>
-                <w:sz w:val="18"/>
+                <w:sz w:val="16"/>
               </w:rPr>
               <w:t>USB 3.0/3.1 Gen 1 · 5 Gbps</w:t>
             </w:r>
@@ -10212,7 +10613,7 @@
             <w:r>
               <w:rPr>
                 <w:b w:val="0"/>
-                <w:sz w:val="18"/>
+                <w:sz w:val="16"/>
               </w:rPr>
               <w:t>lengüeta interior del conector</w:t>
             </w:r>
@@ -10232,7 +10633,7 @@
               <w:rPr>
                 <w:b/>
                 <w:color w:val="0D2B45"/>
-                <w:sz w:val="18"/>
+                <w:sz w:val="16"/>
               </w:rPr>
               <w:t>USB rojo / turquesa</w:t>
             </w:r>
@@ -10249,7 +10650,7 @@
             <w:r>
               <w:rPr>
                 <w:b w:val="0"/>
-                <w:sz w:val="18"/>
+                <w:sz w:val="16"/>
               </w:rPr>
               <w:t>USB 3.1 Gen 2 / 3.2 · 10 Gbps</w:t>
             </w:r>
@@ -10266,7 +10667,7 @@
             <w:r>
               <w:rPr>
                 <w:b w:val="0"/>
-                <w:sz w:val="18"/>
+                <w:sz w:val="16"/>
               </w:rPr>
               <w:t>lengüeta interior del conector</w:t>
             </w:r>
@@ -10286,7 +10687,7 @@
               <w:rPr>
                 <w:b/>
                 <w:color w:val="0D2B45"/>
-                <w:sz w:val="18"/>
+                <w:sz w:val="16"/>
               </w:rPr>
               <w:t>PS/2 verde</w:t>
             </w:r>
@@ -10303,7 +10704,7 @@
             <w:r>
               <w:rPr>
                 <w:b w:val="0"/>
-                <w:sz w:val="18"/>
+                <w:sz w:val="16"/>
               </w:rPr>
               <w:t>Ratón (exclusivo)</w:t>
             </w:r>
@@ -10320,7 +10721,7 @@
             <w:r>
               <w:rPr>
                 <w:b w:val="0"/>
-                <w:sz w:val="18"/>
+                <w:sz w:val="16"/>
               </w:rPr>
               <w:t>puerto mini-DIN de 6</w:t>
             </w:r>
@@ -10340,7 +10741,7 @@
               <w:rPr>
                 <w:b/>
                 <w:color w:val="0D2B45"/>
-                <w:sz w:val="18"/>
+                <w:sz w:val="16"/>
               </w:rPr>
               <w:t>PS/2 morado</w:t>
             </w:r>
@@ -10357,7 +10758,7 @@
             <w:r>
               <w:rPr>
                 <w:b w:val="0"/>
-                <w:sz w:val="18"/>
+                <w:sz w:val="16"/>
               </w:rPr>
               <w:t>Teclado (exclusivo)</w:t>
             </w:r>
@@ -10374,7 +10775,7 @@
             <w:r>
               <w:rPr>
                 <w:b w:val="0"/>
-                <w:sz w:val="18"/>
+                <w:sz w:val="16"/>
               </w:rPr>
               <w:t>puerto mini-DIN de 6</w:t>
             </w:r>
@@ -10394,7 +10795,7 @@
               <w:rPr>
                 <w:b/>
                 <w:color w:val="0D2B45"/>
-                <w:sz w:val="18"/>
+                <w:sz w:val="16"/>
               </w:rPr>
               <w:t>VGA azul</w:t>
             </w:r>
@@ -10411,7 +10812,7 @@
             <w:r>
               <w:rPr>
                 <w:b w:val="0"/>
-                <w:sz w:val="18"/>
+                <w:sz w:val="16"/>
               </w:rPr>
               <w:t>Monitor analógico · 15 pines</w:t>
             </w:r>
@@ -10428,7 +10829,7 @@
             <w:r>
               <w:rPr>
                 <w:b w:val="0"/>
-                <w:sz w:val="18"/>
+                <w:sz w:val="16"/>
               </w:rPr>
               <w:t>interior del conector HD15</w:t>
             </w:r>
@@ -10448,7 +10849,7 @@
               <w:rPr>
                 <w:b/>
                 <w:color w:val="0D2B45"/>
-                <w:sz w:val="18"/>
+                <w:sz w:val="16"/>
               </w:rPr>
               <w:t>LPT burdeos</w:t>
             </w:r>
@@ -10465,7 +10866,7 @@
             <w:r>
               <w:rPr>
                 <w:b w:val="0"/>
-                <w:sz w:val="18"/>
+                <w:sz w:val="16"/>
               </w:rPr>
               <w:t>Impresora paralela · 25 pines</w:t>
             </w:r>
@@ -10482,7 +10883,7 @@
             <w:r>
               <w:rPr>
                 <w:b w:val="0"/>
-                <w:sz w:val="18"/>
+                <w:sz w:val="16"/>
               </w:rPr>
               <w:t>interior del DB-25 (PC99)</w:t>
             </w:r>
@@ -10502,7 +10903,7 @@
               <w:rPr>
                 <w:b/>
                 <w:color w:val="0D2B45"/>
-                <w:sz w:val="18"/>
+                <w:sz w:val="16"/>
               </w:rPr>
               <w:t>Game Port dorado</w:t>
             </w:r>
@@ -10519,7 +10920,7 @@
             <w:r>
               <w:rPr>
                 <w:b w:val="0"/>
-                <w:sz w:val="18"/>
+                <w:sz w:val="16"/>
               </w:rPr>
               <w:t>Joystick / MIDI</w:t>
             </w:r>
@@ -10536,7 +10937,7 @@
             <w:r>
               <w:rPr>
                 <w:b w:val="0"/>
-                <w:sz w:val="18"/>
+                <w:sz w:val="16"/>
               </w:rPr>
               <w:t>tarjeta de sonido (DA-15)</w:t>
             </w:r>
@@ -10556,7 +10957,7 @@
               <w:rPr>
                 <w:b/>
                 <w:color w:val="0D2B45"/>
-                <w:sz w:val="18"/>
+                <w:sz w:val="16"/>
               </w:rPr>
               <w:t>RCA amarillo</w:t>
             </w:r>
@@ -10573,7 +10974,7 @@
             <w:r>
               <w:rPr>
                 <w:b w:val="0"/>
-                <w:sz w:val="18"/>
+                <w:sz w:val="16"/>
               </w:rPr>
               <w:t>Video compuesto SD</w:t>
             </w:r>
@@ -10590,7 +10991,7 @@
             <w:r>
               <w:rPr>
                 <w:b w:val="0"/>
-                <w:sz w:val="18"/>
+                <w:sz w:val="16"/>
               </w:rPr>
               <w:t>conector RCA</w:t>
             </w:r>
@@ -10610,7 +11011,7 @@
               <w:rPr>
                 <w:b/>
                 <w:color w:val="0D2B45"/>
-                <w:sz w:val="18"/>
+                <w:sz w:val="16"/>
               </w:rPr>
               <w:t>Audio verde / rosado / azul</w:t>
             </w:r>
@@ -10627,7 +11028,7 @@
             <w:r>
               <w:rPr>
                 <w:b w:val="0"/>
-                <w:sz w:val="18"/>
+                <w:sz w:val="16"/>
               </w:rPr>
               <w:t>Salida / micrófono / line-in</w:t>
             </w:r>
@@ -10644,7 +11045,7 @@
             <w:r>
               <w:rPr>
                 <w:b w:val="0"/>
-                <w:sz w:val="18"/>
+                <w:sz w:val="16"/>
               </w:rPr>
               <w:t>jacks de 3.5 mm (PC99)</w:t>
             </w:r>
@@ -10664,7 +11065,7 @@
               <w:rPr>
                 <w:b/>
                 <w:color w:val="0D2B45"/>
-                <w:sz w:val="18"/>
+                <w:sz w:val="16"/>
               </w:rPr>
               <w:t>RCA naranja</w:t>
             </w:r>
@@ -10681,7 +11082,7 @@
             <w:r>
               <w:rPr>
                 <w:b w:val="0"/>
-                <w:sz w:val="18"/>
+                <w:sz w:val="16"/>
               </w:rPr>
               <w:t>S/PDIF coaxial · 75 Ω</w:t>
             </w:r>
@@ -10698,7 +11099,7 @@
             <w:r>
               <w:rPr>
                 <w:b w:val="0"/>
-                <w:sz w:val="18"/>
+                <w:sz w:val="16"/>
               </w:rPr>
               <w:t>conector RCA de audio digital</w:t>
             </w:r>
@@ -10718,7 +11119,7 @@
               <w:rPr>
                 <w:b/>
                 <w:color w:val="0D2B45"/>
-                <w:sz w:val="18"/>
+                <w:sz w:val="16"/>
               </w:rPr>
               <w:t>LED verde RJ-45</w:t>
             </w:r>
@@ -10735,7 +11136,7 @@
             <w:r>
               <w:rPr>
                 <w:b w:val="0"/>
-                <w:sz w:val="18"/>
+                <w:sz w:val="16"/>
               </w:rPr>
               <w:t>Enlace de red establecido</w:t>
             </w:r>
@@ -10752,7 +11153,7 @@
             <w:r>
               <w:rPr>
                 <w:b w:val="0"/>
-                <w:sz w:val="18"/>
+                <w:sz w:val="16"/>
               </w:rPr>
               <w:t>puerto Ethernet</w:t>
             </w:r>
@@ -10772,7 +11173,7 @@
               <w:rPr>
                 <w:b/>
                 <w:color w:val="0D2B45"/>
-                <w:sz w:val="18"/>
+                <w:sz w:val="16"/>
               </w:rPr>
               <w:t>LED ámbar RJ-45</w:t>
             </w:r>
@@ -10789,7 +11190,7 @@
             <w:r>
               <w:rPr>
                 <w:b w:val="0"/>
-                <w:sz w:val="18"/>
+                <w:sz w:val="16"/>
               </w:rPr>
               <w:t>Actividad de datos (o 100 Mbps)</w:t>
             </w:r>
@@ -10806,7 +11207,7 @@
             <w:r>
               <w:rPr>
                 <w:b w:val="0"/>
-                <w:sz w:val="18"/>
+                <w:sz w:val="16"/>
               </w:rPr>
               <w:t>puerto Ethernet</w:t>
             </w:r>
@@ -10826,7 +11227,7 @@
               <w:rPr>
                 <w:b/>
                 <w:color w:val="0D2B45"/>
-                <w:sz w:val="18"/>
+                <w:sz w:val="16"/>
               </w:rPr>
               <w:t>Luz roja TOSLINK</w:t>
             </w:r>
@@ -10843,7 +11244,7 @@
             <w:r>
               <w:rPr>
                 <w:b w:val="0"/>
-                <w:sz w:val="18"/>
+                <w:sz w:val="16"/>
               </w:rPr>
               <w:t>Audio óptico activo (~650 nm)</w:t>
             </w:r>
@@ -10860,7 +11261,7 @@
             <w:r>
               <w:rPr>
                 <w:b w:val="0"/>
-                <w:sz w:val="18"/>
+                <w:sz w:val="16"/>
               </w:rPr>
               <w:t>conector de fibra óptica</w:t>
             </w:r>
@@ -10880,7 +11281,7 @@
               <w:rPr>
                 <w:b/>
                 <w:color w:val="0D2B45"/>
-                <w:sz w:val="18"/>
+                <w:sz w:val="16"/>
               </w:rPr>
               <w:t>Fibra amarilla / aqua</w:t>
             </w:r>
@@ -10897,7 +11298,7 @@
             <w:r>
               <w:rPr>
                 <w:b w:val="0"/>
-                <w:sz w:val="18"/>
+                <w:sz w:val="16"/>
               </w:rPr>
               <w:t>Monomodo (larga dist.) / multimodo</w:t>
             </w:r>
@@ -10914,7 +11315,7 @@
             <w:r>
               <w:rPr>
                 <w:b w:val="0"/>
-                <w:sz w:val="18"/>
+                <w:sz w:val="16"/>
               </w:rPr>
               <w:t>cables SFP / LC</w:t>
             </w:r>
@@ -10934,7 +11335,7 @@
               <w:rPr>
                 <w:b/>
                 <w:color w:val="0D2B45"/>
-                <w:sz w:val="18"/>
+                <w:sz w:val="16"/>
               </w:rPr>
               <w:t>Ventana rojo oscuro</w:t>
             </w:r>
@@ -10951,7 +11352,7 @@
             <w:r>
               <w:rPr>
                 <w:b w:val="0"/>
-                <w:sz w:val="18"/>
+                <w:sz w:val="16"/>
               </w:rPr>
               <w:t>Puerto infrarrojo IrDA</w:t>
             </w:r>
@@ -10968,7 +11369,7 @@
             <w:r>
               <w:rPr>
                 <w:b w:val="0"/>
-                <w:sz w:val="18"/>
+                <w:sz w:val="16"/>
               </w:rPr>
               <w:t>panel frontal de la PC</w:t>
             </w:r>
@@ -10982,200 +11383,11 @@
       </w:pPr>
     </w:p>
     <w:p>
-      <w:r>
-        <w:br w:type="page"/>
-      </w:r>
-    </w:p>
-    <w:p>
       <w:pPr>
         <w:pStyle w:val="Heading2"/>
       </w:pPr>
       <w:r>
-        <w:t>No confundir · Pares que se parecen</w:t>
-      </w:r>
-    </w:p>
-    <w:p>
-      <w:pPr>
-        <w:pStyle w:val="ListBullet"/>
-        <w:spacing w:after="40" w:before="0"/>
-      </w:pPr>
-      <w:r>
-        <w:rPr>
-          <w:b/>
-          <w:sz w:val="20"/>
-        </w:rPr>
-        <w:t>RJ-45 vs RJ-11:</w:t>
-      </w:r>
-      <w:r>
-        <w:rPr>
-          <w:b w:val="0"/>
-          <w:sz w:val="20"/>
-        </w:rPr>
-        <w:t xml:space="preserve"> mismo lenguaje, distinto tamaño — 8 contactos (red) frente a 2-4 (teléfono). Forzar uno en el otro dobla los contactos.</w:t>
-      </w:r>
-    </w:p>
-    <w:p>
-      <w:pPr>
-        <w:pStyle w:val="ListBullet"/>
-        <w:spacing w:after="40" w:before="0"/>
-      </w:pPr>
-      <w:r>
-        <w:rPr>
-          <w:b/>
-          <w:sz w:val="20"/>
-        </w:rPr>
-        <w:t>USB-C vs Thunderbolt:</w:t>
-      </w:r>
-      <w:r>
-        <w:rPr>
-          <w:b w:val="0"/>
-          <w:sz w:val="20"/>
-        </w:rPr>
-        <w:t xml:space="preserve"> conector idéntico; solo el </w:t>
-      </w:r>
-      <w:r>
-        <w:rPr>
-          <w:b/>
-          <w:sz w:val="20"/>
-        </w:rPr>
-        <w:t>icono del rayo ⚡</w:t>
-      </w:r>
-      <w:r>
-        <w:rPr>
-          <w:b w:val="0"/>
-          <w:sz w:val="20"/>
-        </w:rPr>
-        <w:t xml:space="preserve"> y la documentación confirman Thunderbolt. Un USB-C normal no mueve eGPU ni dos pantallas.</w:t>
-      </w:r>
-    </w:p>
-    <w:p>
-      <w:pPr>
-        <w:pStyle w:val="ListBullet"/>
-        <w:spacing w:after="40" w:before="0"/>
-      </w:pPr>
-      <w:r>
-        <w:rPr>
-          <w:b/>
-          <w:sz w:val="20"/>
-        </w:rPr>
-        <w:t>HDMI vs DisplayPort:</w:t>
-      </w:r>
-      <w:r>
-        <w:rPr>
-          <w:b w:val="0"/>
-          <w:sz w:val="20"/>
-        </w:rPr>
-        <w:t xml:space="preserve"> HDMI tiene </w:t>
-      </w:r>
-      <w:r>
-        <w:rPr>
-          <w:b/>
-          <w:sz w:val="20"/>
-        </w:rPr>
-        <w:t>dos esquinas biseladas abajo</w:t>
-      </w:r>
-      <w:r>
-        <w:rPr>
-          <w:b w:val="0"/>
-          <w:sz w:val="20"/>
-        </w:rPr>
-        <w:t xml:space="preserve"> y sin pestillo; DisplayPort tiene </w:t>
-      </w:r>
-      <w:r>
-        <w:rPr>
-          <w:b/>
-          <w:sz w:val="20"/>
-        </w:rPr>
-        <w:t>una esquina biselada</w:t>
-      </w:r>
-      <w:r>
-        <w:rPr>
-          <w:b w:val="0"/>
-          <w:sz w:val="20"/>
-        </w:rPr>
-        <w:t xml:space="preserve"> y </w:t>
-      </w:r>
-      <w:r>
-        <w:rPr>
-          <w:b/>
-          <w:sz w:val="20"/>
-        </w:rPr>
-        <w:t>pestillo de seguridad</w:t>
-      </w:r>
-      <w:r>
-        <w:rPr>
-          <w:b w:val="0"/>
-          <w:sz w:val="20"/>
-        </w:rPr>
-        <w:t xml:space="preserve"> arriba.</w:t>
-      </w:r>
-    </w:p>
-    <w:p>
-      <w:pPr>
-        <w:pStyle w:val="ListBullet"/>
-        <w:spacing w:after="40" w:before="0"/>
-      </w:pPr>
-      <w:r>
-        <w:rPr>
-          <w:b/>
-          <w:sz w:val="20"/>
-        </w:rPr>
-        <w:t>USB-A 2.0 vs 3.0:</w:t>
-      </w:r>
-      <w:r>
-        <w:rPr>
-          <w:b w:val="0"/>
-          <w:sz w:val="20"/>
-        </w:rPr>
-        <w:t xml:space="preserve"> misma forma; solo el color interior (negro vs azul) y los 5 contactos extra del 3.0 los delatan.</w:t>
-      </w:r>
-    </w:p>
-    <w:p>
-      <w:pPr>
-        <w:pStyle w:val="ListBullet"/>
-        <w:spacing w:after="40" w:before="0"/>
-      </w:pPr>
-      <w:r>
-        <w:rPr>
-          <w:b/>
-          <w:sz w:val="20"/>
-        </w:rPr>
-        <w:t>DVI-I vs DVI-D:</w:t>
-      </w:r>
-      <w:r>
-        <w:rPr>
-          <w:b w:val="0"/>
-          <w:sz w:val="20"/>
-        </w:rPr>
-        <w:t xml:space="preserve"> el DVI-I tiene 4 pines analógicos alrededor de la blade y adapta a VGA pasivamente; el DVI-D no.</w:t>
-      </w:r>
-    </w:p>
-    <w:p>
-      <w:pPr>
-        <w:pStyle w:val="ListBullet"/>
-        <w:spacing w:after="40" w:before="0"/>
-      </w:pPr>
-      <w:r>
-        <w:rPr>
-          <w:b/>
-          <w:sz w:val="20"/>
-        </w:rPr>
-        <w:t>Mini-B vs Micro-B:</w:t>
-      </w:r>
-      <w:r>
-        <w:rPr>
-          <w:b w:val="0"/>
-          <w:sz w:val="20"/>
-        </w:rPr>
-        <w:t xml:space="preserve"> Mini-B es más grueso y trapezoidal; Micro-B, fino con rebeles. Físicamente incompatibles.</w:t>
-      </w:r>
-    </w:p>
-    <w:p>
-      <w:pPr>
-        <w:pStyle w:val="Heading2"/>
-      </w:pPr>
-      <w:r>
-        <w:t>Datos que suelen faltar · Resumen</w:t>
+        <w:t>Glosario técnico</w:t>
       </w:r>
     </w:p>
     <w:tbl>
@@ -11186,13 +11398,15 @@
         <w:tblLook w:firstColumn="1" w:firstRow="1" w:lastColumn="0" w:lastRow="0" w:noHBand="0" w:noVBand="1" w:val="04A0"/>
       </w:tblPr>
       <w:tblGrid>
-        <w:gridCol w:w="4896"/>
-        <w:gridCol w:w="4896"/>
+        <w:gridCol w:w="2448"/>
+        <w:gridCol w:w="2448"/>
+        <w:gridCol w:w="2448"/>
+        <w:gridCol w:w="2448"/>
       </w:tblGrid>
       <w:tr>
         <w:tc>
           <w:tcPr>
-            <w:tcW w:type="dxa" w:w="2520"/>
+            <w:tcW w:type="dxa" w:w="1656"/>
             <w:shd w:val="clear" w:color="auto" w:fill="0E7C94"/>
           </w:tcPr>
           <w:p>
@@ -11203,15 +11417,15 @@
               <w:rPr>
                 <w:b/>
                 <w:color w:val="FFFFFF"/>
-                <w:sz w:val="18"/>
-              </w:rPr>
-              <w:t>Parámetro</w:t>
-            </w:r>
-          </w:p>
-        </w:tc>
-        <w:tc>
-          <w:tcPr>
-            <w:tcW w:type="dxa" w:w="7272"/>
+                <w:sz w:val="16"/>
+              </w:rPr>
+              <w:t>Término</w:t>
+            </w:r>
+          </w:p>
+        </w:tc>
+        <w:tc>
+          <w:tcPr>
+            <w:tcW w:type="dxa" w:w="3240"/>
             <w:shd w:val="clear" w:color="auto" w:fill="0E7C94"/>
           </w:tcPr>
           <w:p>
@@ -11222,9 +11436,47 @@
               <w:rPr>
                 <w:b/>
                 <w:color w:val="FFFFFF"/>
-                <w:sz w:val="18"/>
-              </w:rPr>
-              <w:t>Valores prácticos</w:t>
+                <w:sz w:val="16"/>
+              </w:rPr>
+              <w:t>Definición</w:t>
+            </w:r>
+          </w:p>
+        </w:tc>
+        <w:tc>
+          <w:tcPr>
+            <w:tcW w:type="dxa" w:w="1656"/>
+            <w:shd w:val="clear" w:color="auto" w:fill="0E7C94"/>
+          </w:tcPr>
+          <w:p>
+            <w:pPr>
+              <w:spacing w:after="20" w:before="20"/>
+            </w:pPr>
+            <w:r>
+              <w:rPr>
+                <w:b/>
+                <w:color w:val="FFFFFF"/>
+                <w:sz w:val="16"/>
+              </w:rPr>
+              <w:t>Término</w:t>
+            </w:r>
+          </w:p>
+        </w:tc>
+        <w:tc>
+          <w:tcPr>
+            <w:tcW w:type="dxa" w:w="3240"/>
+            <w:shd w:val="clear" w:color="auto" w:fill="0E7C94"/>
+          </w:tcPr>
+          <w:p>
+            <w:pPr>
+              <w:spacing w:after="20" w:before="20"/>
+            </w:pPr>
+            <w:r>
+              <w:rPr>
+                <w:b/>
+                <w:color w:val="FFFFFF"/>
+                <w:sz w:val="16"/>
+              </w:rPr>
+              <w:t>Definición</w:t>
             </w:r>
           </w:p>
         </w:tc>
@@ -11232,7 +11484,7 @@
       <w:tr>
         <w:tc>
           <w:tcPr>
-            <w:tcW w:type="dxa" w:w="4896"/>
+            <w:tcW w:type="dxa" w:w="2448"/>
           </w:tcPr>
           <w:p>
             <w:pPr>
@@ -11242,15 +11494,15 @@
               <w:rPr>
                 <w:b/>
                 <w:color w:val="0D2B45"/>
-                <w:sz w:val="18"/>
-              </w:rPr>
-              <w:t>Alimentación USB</w:t>
-            </w:r>
-          </w:p>
-        </w:tc>
-        <w:tc>
-          <w:tcPr>
-            <w:tcW w:type="dxa" w:w="4896"/>
+                <w:sz w:val="16"/>
+              </w:rPr>
+              <w:t>Hot-plug</w:t>
+            </w:r>
+          </w:p>
+        </w:tc>
+        <w:tc>
+          <w:tcPr>
+            <w:tcW w:type="dxa" w:w="2448"/>
           </w:tcPr>
           <w:p>
             <w:pPr>
@@ -11259,9 +11511,43 @@
             <w:r>
               <w:rPr>
                 <w:b w:val="0"/>
-                <w:sz w:val="18"/>
-              </w:rPr>
-              <w:t>2.5 W (2.0) → 4.5 W (3.x) → 7.5 W (BC 1.2) → 240 W (USB-C PD 3.1)</w:t>
+                <w:sz w:val="16"/>
+              </w:rPr>
+              <w:t>Conexión en caliente del periférico</w:t>
+            </w:r>
+          </w:p>
+        </w:tc>
+        <w:tc>
+          <w:tcPr>
+            <w:tcW w:type="dxa" w:w="2448"/>
+          </w:tcPr>
+          <w:p>
+            <w:pPr>
+              <w:spacing w:after="20" w:before="20"/>
+            </w:pPr>
+            <w:r>
+              <w:rPr>
+                <w:b w:val="0"/>
+                <w:sz w:val="16"/>
+              </w:rPr>
+              <w:t>PoE</w:t>
+            </w:r>
+          </w:p>
+        </w:tc>
+        <w:tc>
+          <w:tcPr>
+            <w:tcW w:type="dxa" w:w="2448"/>
+          </w:tcPr>
+          <w:p>
+            <w:pPr>
+              <w:spacing w:after="20" w:before="20"/>
+            </w:pPr>
+            <w:r>
+              <w:rPr>
+                <w:b w:val="0"/>
+                <w:sz w:val="16"/>
+              </w:rPr>
+              <w:t>Alimentación por cable Ethernet</w:t>
             </w:r>
           </w:p>
         </w:tc>
@@ -11269,7 +11555,7 @@
       <w:tr>
         <w:tc>
           <w:tcPr>
-            <w:tcW w:type="dxa" w:w="4896"/>
+            <w:tcW w:type="dxa" w:w="2448"/>
           </w:tcPr>
           <w:p>
             <w:pPr>
@@ -11279,15 +11565,15 @@
               <w:rPr>
                 <w:b/>
                 <w:color w:val="0D2B45"/>
-                <w:sz w:val="18"/>
-              </w:rPr>
-              <w:t>Longitudes de cable</w:t>
-            </w:r>
-          </w:p>
-        </w:tc>
-        <w:tc>
-          <w:tcPr>
-            <w:tcW w:type="dxa" w:w="4896"/>
+                <w:sz w:val="16"/>
+              </w:rPr>
+              <w:t>TMDS</w:t>
+            </w:r>
+          </w:p>
+        </w:tc>
+        <w:tc>
+          <w:tcPr>
+            <w:tcW w:type="dxa" w:w="2448"/>
           </w:tcPr>
           <w:p>
             <w:pPr>
@@ -11296,9 +11582,43 @@
             <w:r>
               <w:rPr>
                 <w:b w:val="0"/>
-                <w:sz w:val="18"/>
-              </w:rPr>
-              <w:t>USB 2.0: 5 m · USB 3.x: 2-3 m · USB4/TB: 0.8-2 m · red: 100 m · RS-232: 15 m · S/PDIF: 10 m · eSATA: 2 m</w:t>
+                <w:sz w:val="16"/>
+              </w:rPr>
+              <w:t>Capa física de video de DVI/HDMI</w:t>
+            </w:r>
+          </w:p>
+        </w:tc>
+        <w:tc>
+          <w:tcPr>
+            <w:tcW w:type="dxa" w:w="2448"/>
+          </w:tcPr>
+          <w:p>
+            <w:pPr>
+              <w:spacing w:after="20" w:before="20"/>
+            </w:pPr>
+            <w:r>
+              <w:rPr>
+                <w:b w:val="0"/>
+                <w:sz w:val="16"/>
+              </w:rPr>
+              <w:t>T568A/B</w:t>
+            </w:r>
+          </w:p>
+        </w:tc>
+        <w:tc>
+          <w:tcPr>
+            <w:tcW w:type="dxa" w:w="2448"/>
+          </w:tcPr>
+          <w:p>
+            <w:pPr>
+              <w:spacing w:after="20" w:before="20"/>
+            </w:pPr>
+            <w:r>
+              <w:rPr>
+                <w:b w:val="0"/>
+                <w:sz w:val="16"/>
+              </w:rPr>
+              <w:t>Orden de hilos del RJ-45</w:t>
             </w:r>
           </w:p>
         </w:tc>
@@ -11306,7 +11626,7 @@
       <w:tr>
         <w:tc>
           <w:tcPr>
-            <w:tcW w:type="dxa" w:w="4896"/>
+            <w:tcW w:type="dxa" w:w="2448"/>
           </w:tcPr>
           <w:p>
             <w:pPr>
@@ -11316,15 +11636,15 @@
               <w:rPr>
                 <w:b/>
                 <w:color w:val="0D2B45"/>
-                <w:sz w:val="18"/>
-              </w:rPr>
-              <w:t>PoE (Ethernet)</w:t>
-            </w:r>
-          </w:p>
-        </w:tc>
-        <w:tc>
-          <w:tcPr>
-            <w:tcW w:type="dxa" w:w="4896"/>
+                <w:sz w:val="16"/>
+              </w:rPr>
+              <w:t>ARC / eARC</w:t>
+            </w:r>
+          </w:p>
+        </w:tc>
+        <w:tc>
+          <w:tcPr>
+            <w:tcW w:type="dxa" w:w="2448"/>
           </w:tcPr>
           <w:p>
             <w:pPr>
@@ -11333,9 +11653,43 @@
             <w:r>
               <w:rPr>
                 <w:b w:val="0"/>
-                <w:sz w:val="18"/>
-              </w:rPr>
-              <w:t>802.3af 15.4 W · 802.3at 30 W · 802.3bt 60-100 W</w:t>
+                <w:sz w:val="16"/>
+              </w:rPr>
+              <w:t>Retorno de audio TV→receptor (HDMI)</w:t>
+            </w:r>
+          </w:p>
+        </w:tc>
+        <w:tc>
+          <w:tcPr>
+            <w:tcW w:type="dxa" w:w="2448"/>
+          </w:tcPr>
+          <w:p>
+            <w:pPr>
+              <w:spacing w:after="20" w:before="20"/>
+            </w:pPr>
+            <w:r>
+              <w:rPr>
+                <w:b w:val="0"/>
+                <w:sz w:val="16"/>
+              </w:rPr>
+              <w:t>SFP / QSFP</w:t>
+            </w:r>
+          </w:p>
+        </w:tc>
+        <w:tc>
+          <w:tcPr>
+            <w:tcW w:type="dxa" w:w="2448"/>
+          </w:tcPr>
+          <w:p>
+            <w:pPr>
+              <w:spacing w:after="20" w:before="20"/>
+            </w:pPr>
+            <w:r>
+              <w:rPr>
+                <w:b w:val="0"/>
+                <w:sz w:val="16"/>
+              </w:rPr>
+              <w:t>Transceptores de fibra 1-400 Gbps</w:t>
             </w:r>
           </w:p>
         </w:tc>
@@ -11343,7 +11697,7 @@
       <w:tr>
         <w:tc>
           <w:tcPr>
-            <w:tcW w:type="dxa" w:w="4896"/>
+            <w:tcW w:type="dxa" w:w="2448"/>
           </w:tcPr>
           <w:p>
             <w:pPr>
@@ -11353,15 +11707,15 @@
               <w:rPr>
                 <w:b/>
                 <w:color w:val="0D2B45"/>
-                <w:sz w:val="18"/>
-              </w:rPr>
-              <w:t>Audio TRRS</w:t>
-            </w:r>
-          </w:p>
-        </w:tc>
-        <w:tc>
-          <w:tcPr>
-            <w:tcW w:type="dxa" w:w="4896"/>
+                <w:sz w:val="16"/>
+              </w:rPr>
+              <w:t>CEC</w:t>
+            </w:r>
+          </w:p>
+        </w:tc>
+        <w:tc>
+          <w:tcPr>
+            <w:tcW w:type="dxa" w:w="2448"/>
           </w:tcPr>
           <w:p>
             <w:pPr>
@@ -11370,9 +11724,43 @@
             <w:r>
               <w:rPr>
                 <w:b w:val="0"/>
-                <w:sz w:val="18"/>
-              </w:rPr>
-              <w:t>CTIA (estándar de smartphones) y OMTP (antiguo): incompatibles entre sí</w:t>
+                <w:sz w:val="16"/>
+              </w:rPr>
+              <w:t>Un mando para todo el HDMI</w:t>
+            </w:r>
+          </w:p>
+        </w:tc>
+        <w:tc>
+          <w:tcPr>
+            <w:tcW w:type="dxa" w:w="2448"/>
+          </w:tcPr>
+          <w:p>
+            <w:pPr>
+              <w:spacing w:after="20" w:before="20"/>
+            </w:pPr>
+            <w:r>
+              <w:rPr>
+                <w:b w:val="0"/>
+                <w:sz w:val="16"/>
+              </w:rPr>
+              <w:t>LC / MPO</w:t>
+            </w:r>
+          </w:p>
+        </w:tc>
+        <w:tc>
+          <w:tcPr>
+            <w:tcW w:type="dxa" w:w="2448"/>
+          </w:tcPr>
+          <w:p>
+            <w:pPr>
+              <w:spacing w:after="20" w:before="20"/>
+            </w:pPr>
+            <w:r>
+              <w:rPr>
+                <w:b w:val="0"/>
+                <w:sz w:val="16"/>
+              </w:rPr>
+              <w:t>Conectores de fibra dúplex / multifibra</w:t>
             </w:r>
           </w:p>
         </w:tc>
@@ -11380,7 +11768,7 @@
       <w:tr>
         <w:tc>
           <w:tcPr>
-            <w:tcW w:type="dxa" w:w="4896"/>
+            <w:tcW w:type="dxa" w:w="2448"/>
           </w:tcPr>
           <w:p>
             <w:pPr>
@@ -11390,15 +11778,15 @@
               <w:rPr>
                 <w:b/>
                 <w:color w:val="0D2B45"/>
-                <w:sz w:val="18"/>
-              </w:rPr>
-              <w:t>Video SD</w:t>
-            </w:r>
-          </w:p>
-        </w:tc>
-        <w:tc>
-          <w:tcPr>
-            <w:tcW w:type="dxa" w:w="4896"/>
+                <w:sz w:val="16"/>
+              </w:rPr>
+              <w:t>HDCP</w:t>
+            </w:r>
+          </w:p>
+        </w:tc>
+        <w:tc>
+          <w:tcPr>
+            <w:tcW w:type="dxa" w:w="2448"/>
           </w:tcPr>
           <w:p>
             <w:pPr>
@@ -11407,79 +11795,43 @@
             <w:r>
               <w:rPr>
                 <w:b w:val="0"/>
-                <w:sz w:val="18"/>
-              </w:rPr>
-              <w:t>Compuesto: 480i/576i multiplexado · S-Video: 480i/576i con Y/C separados</w:t>
-            </w:r>
-          </w:p>
-        </w:tc>
-      </w:tr>
-    </w:tbl>
-    <w:p>
-      <w:pPr>
-        <w:spacing w:after="40"/>
-      </w:pPr>
-    </w:p>
-    <w:p>
-      <w:r>
-        <w:br w:type="page"/>
-      </w:r>
-    </w:p>
-    <w:p>
-      <w:pPr>
-        <w:pStyle w:val="Heading2"/>
-      </w:pPr>
-      <w:r>
-        <w:t>Glosario técnico</w:t>
-      </w:r>
-    </w:p>
-    <w:tbl>
-      <w:tblPr>
-        <w:tblStyle w:val="TableGrid"/>
-        <w:tblW w:type="auto" w:w="0"/>
-        <w:jc w:val="center"/>
-        <w:tblLook w:firstColumn="1" w:firstRow="1" w:lastColumn="0" w:lastRow="0" w:noHBand="0" w:noVBand="1" w:val="04A0"/>
-      </w:tblPr>
-      <w:tblGrid>
-        <w:gridCol w:w="4896"/>
-        <w:gridCol w:w="4896"/>
-      </w:tblGrid>
-      <w:tr>
-        <w:tc>
-          <w:tcPr>
-            <w:tcW w:type="dxa" w:w="2520"/>
-            <w:shd w:val="clear" w:color="auto" w:fill="0E7C94"/>
-          </w:tcPr>
-          <w:p>
-            <w:pPr>
-              <w:spacing w:after="20" w:before="20"/>
-            </w:pPr>
-            <w:r>
-              <w:rPr>
-                <w:b/>
-                <w:color w:val="FFFFFF"/>
-                <w:sz w:val="18"/>
-              </w:rPr>
-              <w:t>Término</w:t>
-            </w:r>
-          </w:p>
-        </w:tc>
-        <w:tc>
-          <w:tcPr>
-            <w:tcW w:type="dxa" w:w="7272"/>
-            <w:shd w:val="clear" w:color="auto" w:fill="0E7C94"/>
-          </w:tcPr>
-          <w:p>
-            <w:pPr>
-              <w:spacing w:after="20" w:before="20"/>
-            </w:pPr>
-            <w:r>
-              <w:rPr>
-                <w:b/>
-                <w:color w:val="FFFFFF"/>
-                <w:sz w:val="18"/>
-              </w:rPr>
-              <w:t>Definición</w:t>
+                <w:sz w:val="16"/>
+              </w:rPr>
+              <w:t>Cifrado de contenido (2.3 para 4K)</w:t>
+            </w:r>
+          </w:p>
+        </w:tc>
+        <w:tc>
+          <w:tcPr>
+            <w:tcW w:type="dxa" w:w="2448"/>
+          </w:tcPr>
+          <w:p>
+            <w:pPr>
+              <w:spacing w:after="20" w:before="20"/>
+            </w:pPr>
+            <w:r>
+              <w:rPr>
+                <w:b w:val="0"/>
+                <w:sz w:val="16"/>
+              </w:rPr>
+              <w:t>DDC / EDID</w:t>
+            </w:r>
+          </w:p>
+        </w:tc>
+        <w:tc>
+          <w:tcPr>
+            <w:tcW w:type="dxa" w:w="2448"/>
+          </w:tcPr>
+          <w:p>
+            <w:pPr>
+              <w:spacing w:after="20" w:before="20"/>
+            </w:pPr>
+            <w:r>
+              <w:rPr>
+                <w:b w:val="0"/>
+                <w:sz w:val="16"/>
+              </w:rPr>
+              <w:t>Identificación del monitor por cable</w:t>
             </w:r>
           </w:p>
         </w:tc>
@@ -11487,7 +11839,7 @@
       <w:tr>
         <w:tc>
           <w:tcPr>
-            <w:tcW w:type="dxa" w:w="4896"/>
+            <w:tcW w:type="dxa" w:w="2448"/>
           </w:tcPr>
           <w:p>
             <w:pPr>
@@ -11497,15 +11849,15 @@
               <w:rPr>
                 <w:b/>
                 <w:color w:val="0D2B45"/>
-                <w:sz w:val="18"/>
-              </w:rPr>
-              <w:t>Hot-plug</w:t>
-            </w:r>
-          </w:p>
-        </w:tc>
-        <w:tc>
-          <w:tcPr>
-            <w:tcW w:type="dxa" w:w="4896"/>
+                <w:sz w:val="16"/>
+              </w:rPr>
+              <w:t>Adaptive-Sync</w:t>
+            </w:r>
+          </w:p>
+        </w:tc>
+        <w:tc>
+          <w:tcPr>
+            <w:tcW w:type="dxa" w:w="2448"/>
           </w:tcPr>
           <w:p>
             <w:pPr>
@@ -11514,9 +11866,43 @@
             <w:r>
               <w:rPr>
                 <w:b w:val="0"/>
-                <w:sz w:val="18"/>
-              </w:rPr>
-              <w:t>Conexión y desconexión del periférico con el equipo encendido.</w:t>
+                <w:sz w:val="16"/>
+              </w:rPr>
+              <w:t>Refresco variable (FreeSync/G-Sync)</w:t>
+            </w:r>
+          </w:p>
+        </w:tc>
+        <w:tc>
+          <w:tcPr>
+            <w:tcW w:type="dxa" w:w="2448"/>
+          </w:tcPr>
+          <w:p>
+            <w:pPr>
+              <w:spacing w:after="20" w:before="20"/>
+            </w:pPr>
+            <w:r>
+              <w:rPr>
+                <w:b w:val="0"/>
+                <w:sz w:val="16"/>
+              </w:rPr>
+              <w:t>Y/C</w:t>
+            </w:r>
+          </w:p>
+        </w:tc>
+        <w:tc>
+          <w:tcPr>
+            <w:tcW w:type="dxa" w:w="2448"/>
+          </w:tcPr>
+          <w:p>
+            <w:pPr>
+              <w:spacing w:after="20" w:before="20"/>
+            </w:pPr>
+            <w:r>
+              <w:rPr>
+                <w:b w:val="0"/>
+                <w:sz w:val="16"/>
+              </w:rPr>
+              <w:t>Luma y croma separadas (S-Video)</w:t>
             </w:r>
           </w:p>
         </w:tc>
@@ -11524,7 +11910,7 @@
       <w:tr>
         <w:tc>
           <w:tcPr>
-            <w:tcW w:type="dxa" w:w="4896"/>
+            <w:tcW w:type="dxa" w:w="2448"/>
           </w:tcPr>
           <w:p>
             <w:pPr>
@@ -11534,15 +11920,15 @@
               <w:rPr>
                 <w:b/>
                 <w:color w:val="0D2B45"/>
-                <w:sz w:val="18"/>
-              </w:rPr>
-              <w:t>TMDS</w:t>
-            </w:r>
-          </w:p>
-        </w:tc>
-        <w:tc>
-          <w:tcPr>
-            <w:tcW w:type="dxa" w:w="4896"/>
+                <w:sz w:val="16"/>
+              </w:rPr>
+              <w:t>UASP</w:t>
+            </w:r>
+          </w:p>
+        </w:tc>
+        <w:tc>
+          <w:tcPr>
+            <w:tcW w:type="dxa" w:w="2448"/>
           </w:tcPr>
           <w:p>
             <w:pPr>
@@ -11551,9 +11937,43 @@
             <w:r>
               <w:rPr>
                 <w:b w:val="0"/>
-                <w:sz w:val="18"/>
-              </w:rPr>
-              <w:t>Transmisión diferencial minimizada: capa física de DVI y HDMI.</w:t>
+                <w:sz w:val="16"/>
+              </w:rPr>
+              <w:t>USB rápido para discos (SCSI)</w:t>
+            </w:r>
+          </w:p>
+        </w:tc>
+        <w:tc>
+          <w:tcPr>
+            <w:tcW w:type="dxa" w:w="2448"/>
+          </w:tcPr>
+          <w:p>
+            <w:pPr>
+              <w:spacing w:after="20" w:before="20"/>
+            </w:pPr>
+            <w:r>
+              <w:rPr>
+                <w:b w:val="0"/>
+                <w:sz w:val="16"/>
+              </w:rPr>
+              <w:t>TRS / TRRS</w:t>
+            </w:r>
+          </w:p>
+        </w:tc>
+        <w:tc>
+          <w:tcPr>
+            <w:tcW w:type="dxa" w:w="2448"/>
+          </w:tcPr>
+          <w:p>
+            <w:pPr>
+              <w:spacing w:after="20" w:before="20"/>
+            </w:pPr>
+            <w:r>
+              <w:rPr>
+                <w:b w:val="0"/>
+                <w:sz w:val="16"/>
+              </w:rPr>
+              <w:t>Audio de 3 o 4 polos (con mic)</w:t>
             </w:r>
           </w:p>
         </w:tc>
@@ -11561,7 +11981,7 @@
       <w:tr>
         <w:tc>
           <w:tcPr>
-            <w:tcW w:type="dxa" w:w="4896"/>
+            <w:tcW w:type="dxa" w:w="2448"/>
           </w:tcPr>
           <w:p>
             <w:pPr>
@@ -11571,15 +11991,15 @@
               <w:rPr>
                 <w:b/>
                 <w:color w:val="0D2B45"/>
-                <w:sz w:val="18"/>
-              </w:rPr>
-              <w:t>ARC / eARC</w:t>
-            </w:r>
-          </w:p>
-        </w:tc>
-        <w:tc>
-          <w:tcPr>
-            <w:tcW w:type="dxa" w:w="4896"/>
+                <w:sz w:val="16"/>
+              </w:rPr>
+              <w:t>USB Power Delivery</w:t>
+            </w:r>
+          </w:p>
+        </w:tc>
+        <w:tc>
+          <w:tcPr>
+            <w:tcW w:type="dxa" w:w="2448"/>
           </w:tcPr>
           <w:p>
             <w:pPr>
@@ -11588,9 +12008,43 @@
             <w:r>
               <w:rPr>
                 <w:b w:val="0"/>
-                <w:sz w:val="18"/>
-              </w:rPr>
-              <w:t>Canal de retorno de audio del TV al receptor por HDMI (eARC: sin pérdida).</w:t>
+                <w:sz w:val="16"/>
+              </w:rPr>
+              <w:t>Hasta 240 W por USB-C (5-48 V)</w:t>
+            </w:r>
+          </w:p>
+        </w:tc>
+        <w:tc>
+          <w:tcPr>
+            <w:tcW w:type="dxa" w:w="2448"/>
+          </w:tcPr>
+          <w:p>
+            <w:pPr>
+              <w:spacing w:after="20" w:before="20"/>
+            </w:pPr>
+            <w:r>
+              <w:rPr>
+                <w:b w:val="0"/>
+                <w:sz w:val="16"/>
+              </w:rPr>
+              <w:t>S/PDIF</w:t>
+            </w:r>
+          </w:p>
+        </w:tc>
+        <w:tc>
+          <w:tcPr>
+            <w:tcW w:type="dxa" w:w="2448"/>
+          </w:tcPr>
+          <w:p>
+            <w:pPr>
+              <w:spacing w:after="20" w:before="20"/>
+            </w:pPr>
+            <w:r>
+              <w:rPr>
+                <w:b w:val="0"/>
+                <w:sz w:val="16"/>
+              </w:rPr>
+              <w:t>Audio digital óptico o coaxial</w:t>
             </w:r>
           </w:p>
         </w:tc>
@@ -11598,7 +12052,7 @@
       <w:tr>
         <w:tc>
           <w:tcPr>
-            <w:tcW w:type="dxa" w:w="4896"/>
+            <w:tcW w:type="dxa" w:w="2448"/>
           </w:tcPr>
           <w:p>
             <w:pPr>
@@ -11608,15 +12062,15 @@
               <w:rPr>
                 <w:b/>
                 <w:color w:val="0D2B45"/>
-                <w:sz w:val="18"/>
-              </w:rPr>
-              <w:t>CEC</w:t>
-            </w:r>
-          </w:p>
-        </w:tc>
-        <w:tc>
-          <w:tcPr>
-            <w:tcW w:type="dxa" w:w="4896"/>
+                <w:sz w:val="16"/>
+              </w:rPr>
+              <w:t>Alt Mode</w:t>
+            </w:r>
+          </w:p>
+        </w:tc>
+        <w:tc>
+          <w:tcPr>
+            <w:tcW w:type="dxa" w:w="2448"/>
           </w:tcPr>
           <w:p>
             <w:pPr>
@@ -11625,9 +12079,43 @@
             <w:r>
               <w:rPr>
                 <w:b w:val="0"/>
-                <w:sz w:val="18"/>
-              </w:rPr>
-              <w:t>Control remoto único de todos los dispositivos HDMI interconectados.</w:t>
+                <w:sz w:val="16"/>
+              </w:rPr>
+              <w:t>Video/Thunderbolt por USB-C</w:t>
+            </w:r>
+          </w:p>
+        </w:tc>
+        <w:tc>
+          <w:tcPr>
+            <w:tcW w:type="dxa" w:w="2448"/>
+          </w:tcPr>
+          <w:p>
+            <w:pPr>
+              <w:spacing w:after="20" w:before="20"/>
+            </w:pPr>
+            <w:r>
+              <w:rPr>
+                <w:b w:val="0"/>
+                <w:sz w:val="16"/>
+              </w:rPr>
+              <w:t>UHS-I/II/III</w:t>
+            </w:r>
+          </w:p>
+        </w:tc>
+        <w:tc>
+          <w:tcPr>
+            <w:tcW w:type="dxa" w:w="2448"/>
+          </w:tcPr>
+          <w:p>
+            <w:pPr>
+              <w:spacing w:after="20" w:before="20"/>
+            </w:pPr>
+            <w:r>
+              <w:rPr>
+                <w:b w:val="0"/>
+                <w:sz w:val="16"/>
+              </w:rPr>
+              <w:t>Bus de tarjetas SD (104-624 MB/s)</w:t>
             </w:r>
           </w:p>
         </w:tc>
@@ -11635,7 +12123,7 @@
       <w:tr>
         <w:tc>
           <w:tcPr>
-            <w:tcW w:type="dxa" w:w="4896"/>
+            <w:tcW w:type="dxa" w:w="2448"/>
           </w:tcPr>
           <w:p>
             <w:pPr>
@@ -11645,15 +12133,15 @@
               <w:rPr>
                 <w:b/>
                 <w:color w:val="0D2B45"/>
-                <w:sz w:val="18"/>
-              </w:rPr>
-              <w:t>HDCP</w:t>
-            </w:r>
-          </w:p>
-        </w:tc>
-        <w:tc>
-          <w:tcPr>
-            <w:tcW w:type="dxa" w:w="4896"/>
+                <w:sz w:val="16"/>
+              </w:rPr>
+              <w:t>MST / SST</w:t>
+            </w:r>
+          </w:p>
+        </w:tc>
+        <w:tc>
+          <w:tcPr>
+            <w:tcW w:type="dxa" w:w="2448"/>
           </w:tcPr>
           <w:p>
             <w:pPr>
@@ -11662,35 +12150,15 @@
             <w:r>
               <w:rPr>
                 <w:b w:val="0"/>
-                <w:sz w:val="18"/>
-              </w:rPr>
-              <w:t>Cifrado de contenido protegido en HDMI/DisplayPort (2.3 para 4K).</w:t>
-            </w:r>
-          </w:p>
-        </w:tc>
-      </w:tr>
-      <w:tr>
-        <w:tc>
-          <w:tcPr>
-            <w:tcW w:type="dxa" w:w="4896"/>
-          </w:tcPr>
-          <w:p>
-            <w:pPr>
-              <w:spacing w:after="20" w:before="20"/>
-            </w:pPr>
-            <w:r>
-              <w:rPr>
-                <w:b/>
-                <w:color w:val="0D2B45"/>
-                <w:sz w:val="18"/>
-              </w:rPr>
-              <w:t>DSC</w:t>
-            </w:r>
-          </w:p>
-        </w:tc>
-        <w:tc>
-          <w:tcPr>
-            <w:tcW w:type="dxa" w:w="4896"/>
+                <w:sz w:val="16"/>
+              </w:rPr>
+              <w:t>Cadena de monitores DP / simple</w:t>
+            </w:r>
+          </w:p>
+        </w:tc>
+        <w:tc>
+          <w:tcPr>
+            <w:tcW w:type="dxa" w:w="2448"/>
           </w:tcPr>
           <w:p>
             <w:pPr>
@@ -11699,35 +12167,15 @@
             <w:r>
               <w:rPr>
                 <w:b w:val="0"/>
-                <w:sz w:val="18"/>
-              </w:rPr>
-              <w:t>Display Stream Compression: compresión visual sin pérdida perceptible.</w:t>
-            </w:r>
-          </w:p>
-        </w:tc>
-      </w:tr>
-      <w:tr>
-        <w:tc>
-          <w:tcPr>
-            <w:tcW w:type="dxa" w:w="4896"/>
-          </w:tcPr>
-          <w:p>
-            <w:pPr>
-              <w:spacing w:after="20" w:before="20"/>
-            </w:pPr>
-            <w:r>
-              <w:rPr>
-                <w:b/>
-                <w:color w:val="0D2B45"/>
-                <w:sz w:val="18"/>
-              </w:rPr>
-              <w:t>Adaptive-Sync</w:t>
-            </w:r>
-          </w:p>
-        </w:tc>
-        <w:tc>
-          <w:tcPr>
-            <w:tcW w:type="dxa" w:w="4896"/>
+                <w:sz w:val="16"/>
+              </w:rPr>
+              <w:t>Y/C</w:t>
+            </w:r>
+          </w:p>
+        </w:tc>
+        <w:tc>
+          <w:tcPr>
+            <w:tcW w:type="dxa" w:w="2448"/>
           </w:tcPr>
           <w:p>
             <w:pPr>
@@ -11736,527 +12184,9 @@
             <w:r>
               <w:rPr>
                 <w:b w:val="0"/>
-                <w:sz w:val="18"/>
-              </w:rPr>
-              <w:t>Sincronización variable de refresco (FreeSync / G-Sync Compatible).</w:t>
-            </w:r>
-          </w:p>
-        </w:tc>
-      </w:tr>
-      <w:tr>
-        <w:tc>
-          <w:tcPr>
-            <w:tcW w:type="dxa" w:w="4896"/>
-          </w:tcPr>
-          <w:p>
-            <w:pPr>
-              <w:spacing w:after="20" w:before="20"/>
-            </w:pPr>
-            <w:r>
-              <w:rPr>
-                <w:b/>
-                <w:color w:val="0D2B45"/>
-                <w:sz w:val="18"/>
-              </w:rPr>
-              <w:t>MST / SST</w:t>
-            </w:r>
-          </w:p>
-        </w:tc>
-        <w:tc>
-          <w:tcPr>
-            <w:tcW w:type="dxa" w:w="4896"/>
-          </w:tcPr>
-          <w:p>
-            <w:pPr>
-              <w:spacing w:after="20" w:before="20"/>
-            </w:pPr>
-            <w:r>
-              <w:rPr>
-                <w:b w:val="0"/>
-                <w:sz w:val="18"/>
-              </w:rPr>
-              <w:t>Multi-Stream (cadena de monitores) / Single-Stream en DisplayPort.</w:t>
-            </w:r>
-          </w:p>
-        </w:tc>
-      </w:tr>
-      <w:tr>
-        <w:tc>
-          <w:tcPr>
-            <w:tcW w:type="dxa" w:w="4896"/>
-          </w:tcPr>
-          <w:p>
-            <w:pPr>
-              <w:spacing w:after="20" w:before="20"/>
-            </w:pPr>
-            <w:r>
-              <w:rPr>
-                <w:b/>
-                <w:color w:val="0D2B45"/>
-                <w:sz w:val="18"/>
-              </w:rPr>
-              <w:t>UASP</w:t>
-            </w:r>
-          </w:p>
-        </w:tc>
-        <w:tc>
-          <w:tcPr>
-            <w:tcW w:type="dxa" w:w="4896"/>
-          </w:tcPr>
-          <w:p>
-            <w:pPr>
-              <w:spacing w:after="20" w:before="20"/>
-            </w:pPr>
-            <w:r>
-              <w:rPr>
-                <w:b w:val="0"/>
-                <w:sz w:val="18"/>
-              </w:rPr>
-              <w:t>Protocolo SCSI sobre USB: discos externos un 20-30 % más rápidos.</w:t>
-            </w:r>
-          </w:p>
-        </w:tc>
-      </w:tr>
-      <w:tr>
-        <w:tc>
-          <w:tcPr>
-            <w:tcW w:type="dxa" w:w="4896"/>
-          </w:tcPr>
-          <w:p>
-            <w:pPr>
-              <w:spacing w:after="20" w:before="20"/>
-            </w:pPr>
-            <w:r>
-              <w:rPr>
-                <w:b/>
-                <w:color w:val="0D2B45"/>
-                <w:sz w:val="18"/>
-              </w:rPr>
-              <w:t>USB Power Delivery</w:t>
-            </w:r>
-          </w:p>
-        </w:tc>
-        <w:tc>
-          <w:tcPr>
-            <w:tcW w:type="dxa" w:w="4896"/>
-          </w:tcPr>
-          <w:p>
-            <w:pPr>
-              <w:spacing w:after="20" w:before="20"/>
-            </w:pPr>
-            <w:r>
-              <w:rPr>
-                <w:b w:val="0"/>
-                <w:sz w:val="18"/>
-              </w:rPr>
-              <w:t>Negociación de hasta 240 W por USB-C (5-48 V).</w:t>
-            </w:r>
-          </w:p>
-        </w:tc>
-      </w:tr>
-      <w:tr>
-        <w:tc>
-          <w:tcPr>
-            <w:tcW w:type="dxa" w:w="4896"/>
-          </w:tcPr>
-          <w:p>
-            <w:pPr>
-              <w:spacing w:after="20" w:before="20"/>
-            </w:pPr>
-            <w:r>
-              <w:rPr>
-                <w:b/>
-                <w:color w:val="0D2B45"/>
-                <w:sz w:val="18"/>
-              </w:rPr>
-              <w:t>Alt Mode</w:t>
-            </w:r>
-          </w:p>
-        </w:tc>
-        <w:tc>
-          <w:tcPr>
-            <w:tcW w:type="dxa" w:w="4896"/>
-          </w:tcPr>
-          <w:p>
-            <w:pPr>
-              <w:spacing w:after="20" w:before="20"/>
-            </w:pPr>
-            <w:r>
-              <w:rPr>
-                <w:b w:val="0"/>
-                <w:sz w:val="18"/>
-              </w:rPr>
-              <w:t>Modo alternativo USB-C: video (DP/HDMI) o Thunderbolt por el mismo cable.</w:t>
-            </w:r>
-          </w:p>
-        </w:tc>
-      </w:tr>
-      <w:tr>
-        <w:tc>
-          <w:tcPr>
-            <w:tcW w:type="dxa" w:w="4896"/>
-          </w:tcPr>
-          <w:p>
-            <w:pPr>
-              <w:spacing w:after="20" w:before="20"/>
-            </w:pPr>
-            <w:r>
-              <w:rPr>
-                <w:b/>
-                <w:color w:val="0D2B45"/>
-                <w:sz w:val="18"/>
-              </w:rPr>
-              <w:t>PoE</w:t>
-            </w:r>
-          </w:p>
-        </w:tc>
-        <w:tc>
-          <w:tcPr>
-            <w:tcW w:type="dxa" w:w="4896"/>
-          </w:tcPr>
-          <w:p>
-            <w:pPr>
-              <w:spacing w:after="20" w:before="20"/>
-            </w:pPr>
-            <w:r>
-              <w:rPr>
-                <w:b w:val="0"/>
-                <w:sz w:val="18"/>
-              </w:rPr>
-              <w:t>Power over Ethernet: alimentación por cable de red (hasta 60-100 W).</w:t>
-            </w:r>
-          </w:p>
-        </w:tc>
-      </w:tr>
-      <w:tr>
-        <w:tc>
-          <w:tcPr>
-            <w:tcW w:type="dxa" w:w="4896"/>
-          </w:tcPr>
-          <w:p>
-            <w:pPr>
-              <w:spacing w:after="20" w:before="20"/>
-            </w:pPr>
-            <w:r>
-              <w:rPr>
-                <w:b/>
-                <w:color w:val="0D2B45"/>
-                <w:sz w:val="18"/>
-              </w:rPr>
-              <w:t>T568A / T568B</w:t>
-            </w:r>
-          </w:p>
-        </w:tc>
-        <w:tc>
-          <w:tcPr>
-            <w:tcW w:type="dxa" w:w="4896"/>
-          </w:tcPr>
-          <w:p>
-            <w:pPr>
-              <w:spacing w:after="20" w:before="20"/>
-            </w:pPr>
-            <w:r>
-              <w:rPr>
-                <w:b w:val="0"/>
-                <w:sz w:val="18"/>
-              </w:rPr>
-              <w:t>Orden de hilos estándar en los conectores RJ-45.</w:t>
-            </w:r>
-          </w:p>
-        </w:tc>
-      </w:tr>
-      <w:tr>
-        <w:tc>
-          <w:tcPr>
-            <w:tcW w:type="dxa" w:w="4896"/>
-          </w:tcPr>
-          <w:p>
-            <w:pPr>
-              <w:spacing w:after="20" w:before="20"/>
-            </w:pPr>
-            <w:r>
-              <w:rPr>
-                <w:b/>
-                <w:color w:val="0D2B45"/>
-                <w:sz w:val="18"/>
-              </w:rPr>
-              <w:t>SFP / QSFP</w:t>
-            </w:r>
-          </w:p>
-        </w:tc>
-        <w:tc>
-          <w:tcPr>
-            <w:tcW w:type="dxa" w:w="4896"/>
-          </w:tcPr>
-          <w:p>
-            <w:pPr>
-              <w:spacing w:after="20" w:before="20"/>
-            </w:pPr>
-            <w:r>
-              <w:rPr>
-                <w:b w:val="0"/>
-                <w:sz w:val="18"/>
-              </w:rPr>
-              <w:t>Transceptores modulares de fibra óptica (1-400 Gbps).</w:t>
-            </w:r>
-          </w:p>
-        </w:tc>
-      </w:tr>
-      <w:tr>
-        <w:tc>
-          <w:tcPr>
-            <w:tcW w:type="dxa" w:w="4896"/>
-          </w:tcPr>
-          <w:p>
-            <w:pPr>
-              <w:spacing w:after="20" w:before="20"/>
-            </w:pPr>
-            <w:r>
-              <w:rPr>
-                <w:b/>
-                <w:color w:val="0D2B45"/>
-                <w:sz w:val="18"/>
-              </w:rPr>
-              <w:t>LC / MPO</w:t>
-            </w:r>
-          </w:p>
-        </w:tc>
-        <w:tc>
-          <w:tcPr>
-            <w:tcW w:type="dxa" w:w="4896"/>
-          </w:tcPr>
-          <w:p>
-            <w:pPr>
-              <w:spacing w:after="20" w:before="20"/>
-            </w:pPr>
-            <w:r>
-              <w:rPr>
-                <w:b w:val="0"/>
-                <w:sz w:val="18"/>
-              </w:rPr>
-              <w:t>Conectores de fibra dúplex pequeños / multifibra de datacenter.</w:t>
-            </w:r>
-          </w:p>
-        </w:tc>
-      </w:tr>
-      <w:tr>
-        <w:tc>
-          <w:tcPr>
-            <w:tcW w:type="dxa" w:w="4896"/>
-          </w:tcPr>
-          <w:p>
-            <w:pPr>
-              <w:spacing w:after="20" w:before="20"/>
-            </w:pPr>
-            <w:r>
-              <w:rPr>
-                <w:b/>
-                <w:color w:val="0D2B45"/>
-                <w:sz w:val="18"/>
-              </w:rPr>
-              <w:t>DDC / EDID</w:t>
-            </w:r>
-          </w:p>
-        </w:tc>
-        <w:tc>
-          <w:tcPr>
-            <w:tcW w:type="dxa" w:w="4896"/>
-          </w:tcPr>
-          <w:p>
-            <w:pPr>
-              <w:spacing w:after="20" w:before="20"/>
-            </w:pPr>
-            <w:r>
-              <w:rPr>
-                <w:b w:val="0"/>
-                <w:sz w:val="18"/>
-              </w:rPr>
-              <w:t>Identificación del monitor por el cable (plug &amp; play de video).</w:t>
-            </w:r>
-          </w:p>
-        </w:tc>
-      </w:tr>
-      <w:tr>
-        <w:tc>
-          <w:tcPr>
-            <w:tcW w:type="dxa" w:w="4896"/>
-          </w:tcPr>
-          <w:p>
-            <w:pPr>
-              <w:spacing w:after="20" w:before="20"/>
-            </w:pPr>
-            <w:r>
-              <w:rPr>
-                <w:b/>
-                <w:color w:val="0D2B45"/>
-                <w:sz w:val="18"/>
-              </w:rPr>
-              <w:t>Y/C (S-Video)</w:t>
-            </w:r>
-          </w:p>
-        </w:tc>
-        <w:tc>
-          <w:tcPr>
-            <w:tcW w:type="dxa" w:w="4896"/>
-          </w:tcPr>
-          <w:p>
-            <w:pPr>
-              <w:spacing w:after="20" w:before="20"/>
-            </w:pPr>
-            <w:r>
-              <w:rPr>
-                <w:b w:val="0"/>
-                <w:sz w:val="18"/>
-              </w:rPr>
-              <w:t>Luminancia y crominancia separadas para mejor imagen.</w:t>
-            </w:r>
-          </w:p>
-        </w:tc>
-      </w:tr>
-      <w:tr>
-        <w:tc>
-          <w:tcPr>
-            <w:tcW w:type="dxa" w:w="4896"/>
-          </w:tcPr>
-          <w:p>
-            <w:pPr>
-              <w:spacing w:after="20" w:before="20"/>
-            </w:pPr>
-            <w:r>
-              <w:rPr>
-                <w:b/>
-                <w:color w:val="0D2B45"/>
-                <w:sz w:val="18"/>
-              </w:rPr>
-              <w:t>TRS / TRRS</w:t>
-            </w:r>
-          </w:p>
-        </w:tc>
-        <w:tc>
-          <w:tcPr>
-            <w:tcW w:type="dxa" w:w="4896"/>
-          </w:tcPr>
-          <w:p>
-            <w:pPr>
-              <w:spacing w:after="20" w:before="20"/>
-            </w:pPr>
-            <w:r>
-              <w:rPr>
-                <w:b w:val="0"/>
-                <w:sz w:val="18"/>
-              </w:rPr>
-              <w:t>Conector de audio de 3 o 4 polos (con micrófono).</w:t>
-            </w:r>
-          </w:p>
-        </w:tc>
-      </w:tr>
-      <w:tr>
-        <w:tc>
-          <w:tcPr>
-            <w:tcW w:type="dxa" w:w="4896"/>
-          </w:tcPr>
-          <w:p>
-            <w:pPr>
-              <w:spacing w:after="20" w:before="20"/>
-            </w:pPr>
-            <w:r>
-              <w:rPr>
-                <w:b/>
-                <w:color w:val="0D2B45"/>
-                <w:sz w:val="18"/>
-              </w:rPr>
-              <w:t>S/PDIF</w:t>
-            </w:r>
-          </w:p>
-        </w:tc>
-        <w:tc>
-          <w:tcPr>
-            <w:tcW w:type="dxa" w:w="4896"/>
-          </w:tcPr>
-          <w:p>
-            <w:pPr>
-              <w:spacing w:after="20" w:before="20"/>
-            </w:pPr>
-            <w:r>
-              <w:rPr>
-                <w:b w:val="0"/>
-                <w:sz w:val="18"/>
-              </w:rPr>
-              <w:t>Interfaz de audio digital de Sony/Philips (óptica o coaxial).</w:t>
-            </w:r>
-          </w:p>
-        </w:tc>
-      </w:tr>
-      <w:tr>
-        <w:tc>
-          <w:tcPr>
-            <w:tcW w:type="dxa" w:w="4896"/>
-          </w:tcPr>
-          <w:p>
-            <w:pPr>
-              <w:spacing w:after="20" w:before="20"/>
-            </w:pPr>
-            <w:r>
-              <w:rPr>
-                <w:b/>
-                <w:color w:val="0D2B45"/>
-                <w:sz w:val="18"/>
-              </w:rPr>
-              <w:t>UHS-I/II/III</w:t>
-            </w:r>
-          </w:p>
-        </w:tc>
-        <w:tc>
-          <w:tcPr>
-            <w:tcW w:type="dxa" w:w="4896"/>
-          </w:tcPr>
-          <w:p>
-            <w:pPr>
-              <w:spacing w:after="20" w:before="20"/>
-            </w:pPr>
-            <w:r>
-              <w:rPr>
-                <w:b w:val="0"/>
-                <w:sz w:val="18"/>
-              </w:rPr>
-              <w:t>Estándares de bus de tarjetas SD (104-624 MB/s).</w:t>
-            </w:r>
-          </w:p>
-        </w:tc>
-      </w:tr>
-      <w:tr>
-        <w:tc>
-          <w:tcPr>
-            <w:tcW w:type="dxa" w:w="4896"/>
-          </w:tcPr>
-          <w:p>
-            <w:pPr>
-              <w:spacing w:after="20" w:before="20"/>
-            </w:pPr>
-            <w:r>
-              <w:rPr>
-                <w:b/>
-                <w:color w:val="0D2B45"/>
-                <w:sz w:val="18"/>
-              </w:rPr>
-              <w:t>IrDA SIR/FIR</w:t>
-            </w:r>
-          </w:p>
-        </w:tc>
-        <w:tc>
-          <w:tcPr>
-            <w:tcW w:type="dxa" w:w="4896"/>
-          </w:tcPr>
-          <w:p>
-            <w:pPr>
-              <w:spacing w:after="20" w:before="20"/>
-            </w:pPr>
-            <w:r>
-              <w:rPr>
-                <w:b w:val="0"/>
-                <w:sz w:val="18"/>
-              </w:rPr>
-              <w:t>Infrarrojo lento (115.2 kbps) y rápido (4 Mbps).</w:t>
+                <w:sz w:val="16"/>
+              </w:rPr>
+              <w:t>Luma y croma separadas (S-Video)</w:t>
             </w:r>
           </w:p>
         </w:tc>

</xml_diff>